<commit_message>
adress the review comments
</commit_message>
<xml_diff>
--- a/public/cv/Dessi_Georgieva_OpenAI_Codex_CV.docx
+++ b/public/cv/Dessi_Georgieva_OpenAI_Codex_CV.docx
@@ -568,7 +568,7 @@
         <w:rPr>
           <w:i w:val="0"/>
         </w:rPr>
-        <w:t xml:space="preserve"> · London · Nov 2023 – Present</w:t>
+        <w:t xml:space="preserve"> · London · Nov 2023 - Present</w:t>
       </w:r>
     </w:p>
     <w:p>
@@ -636,7 +636,7 @@
         <w:rPr>
           <w:i w:val="0"/>
         </w:rPr>
-        <w:t xml:space="preserve"> · London · Mar 2023 – Nov 2023</w:t>
+        <w:t xml:space="preserve"> · London · Mar 2023 - Nov 2023</w:t>
       </w:r>
     </w:p>
     <w:p>
@@ -676,7 +676,7 @@
         <w:rPr>
           <w:i w:val="0"/>
         </w:rPr>
-        <w:t xml:space="preserve"> · London · Jan 2021 – Mar 2023</w:t>
+        <w:t xml:space="preserve"> · London · Jan 2021 - Mar 2023</w:t>
       </w:r>
     </w:p>
     <w:p>
@@ -716,7 +716,7 @@
         <w:rPr>
           <w:i w:val="0"/>
         </w:rPr>
-        <w:t xml:space="preserve"> · London · 2017 – 2020</w:t>
+        <w:t xml:space="preserve"> · London · 2017 - 2020</w:t>
       </w:r>
     </w:p>
     <w:p>
@@ -806,7 +806,7 @@
         <w:rPr>
           <w:i w:val="0"/>
         </w:rPr>
-        <w:t>, University of York · 2009 – 2011</w:t>
+        <w:t>, University of York · 2009 - 2011</w:t>
       </w:r>
     </w:p>
     <w:p>
@@ -824,7 +824,7 @@
         <w:rPr>
           <w:i w:val="0"/>
         </w:rPr>
-        <w:t>, Sofia University · 2003 – 2007</w:t>
+        <w:t>, Sofia University · 2003 - 2007</w:t>
       </w:r>
     </w:p>
     <w:sectPr>

</xml_diff>